<commit_message>
fix(nlu): stop bare 'who is absent on [date]' misrouting to admin_students_out_now
Found while verifying the date-parsing feature: without class-scoping
words ('in my class'/'in my section'), 'who is absent on 29 july' /
'who is absent on 21 july' misclassified as admin_students_out_now -- a
completely different intent (students currently out on a hostel pass
right now, not classroom attendance on a specific date). Adding 'in my
class' already resolved it correctly; the gap was specifically the bare
'who is absent on [date]' shape.

rebuild-dataset-v9.ts adds 4 bare date-referencing examples to
faculty_class_attendance. Verified: both previously-broken phrasings now
resolve correctly (0.977-1.000), and admin_students_out_now's own real
queries are completely unaffected (still 1.000 confidence).
</commit_message>
<xml_diff>
--- a/EOS_Intent_Training_Dataset_English_Only.docx
+++ b/EOS_Intent_Training_Dataset_English_Only.docx
@@ -30316,7 +30316,7 @@
           <w:b/>
           <w:bCs/>
         </w:rPr>
-        <w:t xml:space="preserve">examples (39):</w:t>
+        <w:t xml:space="preserve">examples (43):</w:t>
       </w:r>
     </w:p>
     <w:p>
@@ -30980,6 +30980,74 @@
           <w:szCs w:val="19"/>
         </w:rPr>
         <w:t xml:space="preserve">who is absnt today in my class</w:t>
+      </w:r>
+    </w:p>
+    <w:p>
+      <w:pPr>
+        <w:pStyle w:val="ListParagraph"/>
+        <w:numPr>
+          <w:ilvl w:val="0"/>
+          <w:numId w:val="2"/>
+        </w:numPr>
+        <w:spacing w:after="20"/>
+      </w:pPr>
+      <w:r>
+        <w:rPr>
+          <w:sz w:val="19"/>
+          <w:szCs w:val="19"/>
+        </w:rPr>
+        <w:t xml:space="preserve">who is absent on 21 july</w:t>
+      </w:r>
+    </w:p>
+    <w:p>
+      <w:pPr>
+        <w:pStyle w:val="ListParagraph"/>
+        <w:numPr>
+          <w:ilvl w:val="0"/>
+          <w:numId w:val="2"/>
+        </w:numPr>
+        <w:spacing w:after="20"/>
+      </w:pPr>
+      <w:r>
+        <w:rPr>
+          <w:sz w:val="19"/>
+          <w:szCs w:val="19"/>
+        </w:rPr>
+        <w:t xml:space="preserve">who was absent on 29 july</w:t>
+      </w:r>
+    </w:p>
+    <w:p>
+      <w:pPr>
+        <w:pStyle w:val="ListParagraph"/>
+        <w:numPr>
+          <w:ilvl w:val="0"/>
+          <w:numId w:val="2"/>
+        </w:numPr>
+        <w:spacing w:after="20"/>
+      </w:pPr>
+      <w:r>
+        <w:rPr>
+          <w:sz w:val="19"/>
+          <w:szCs w:val="19"/>
+        </w:rPr>
+        <w:t xml:space="preserve">who is absent on 13 august</w:t>
+      </w:r>
+    </w:p>
+    <w:p>
+      <w:pPr>
+        <w:pStyle w:val="ListParagraph"/>
+        <w:numPr>
+          <w:ilvl w:val="0"/>
+          <w:numId w:val="2"/>
+        </w:numPr>
+        <w:spacing w:after="20"/>
+      </w:pPr>
+      <w:r>
+        <w:rPr>
+          <w:sz w:val="19"/>
+          <w:szCs w:val="19"/>
+        </w:rPr>
+        <w:t xml:space="preserve">who was present on 21 july</w:t>
       </w:r>
     </w:p>
     <w:p>

</xml_diff>

<commit_message>
feat(dataset): pad 11 low-sample intents from 5-9 examples up to 9-13
All 11 already classified correctly against fresh paraphrases when tested
directly (0.76-1.0 confidence) -- this isn't a live bug fix, it's safety
margin against future collisions as more intents get added, per an
explicit request not to leave low-sample-count intents as a latent risk.
44 fresh examples added across wallet_recharge, get_wallet_balance,
project_join_requests_status, get_my_projects, get_active_surveys,
submit_feedback_form, view_department_achievements,
get_result_publication_status, alumni_network_search, password_reset,
library_hours. Verified: all 11 original test phrasings still resolve
correctly post-padding, several with improved confidence (e.g.
get_wallet_balance 0.927 -> 1.000).
</commit_message>
<xml_diff>
--- a/EOS_Intent_Training_Dataset_English_Only.docx
+++ b/EOS_Intent_Training_Dataset_English_Only.docx
@@ -2408,7 +2408,7 @@
           <w:b/>
           <w:bCs/>
         </w:rPr>
-        <w:t xml:space="preserve">examples (9):</w:t>
+        <w:t xml:space="preserve">examples (13):</w:t>
       </w:r>
     </w:p>
     <w:p>
@@ -2562,6 +2562,74 @@
           <w:szCs w:val="19"/>
         </w:rPr>
         <w:t xml:space="preserve">i want to reload my prepaid card</w:t>
+      </w:r>
+    </w:p>
+    <w:p>
+      <w:pPr>
+        <w:pStyle w:val="ListParagraph"/>
+        <w:numPr>
+          <w:ilvl w:val="0"/>
+          <w:numId w:val="2"/>
+        </w:numPr>
+        <w:spacing w:after="20"/>
+      </w:pPr>
+      <w:r>
+        <w:rPr>
+          <w:sz w:val="19"/>
+          <w:szCs w:val="19"/>
+        </w:rPr>
+        <w:t xml:space="preserve">i want to add cash to my campus account</w:t>
+      </w:r>
+    </w:p>
+    <w:p>
+      <w:pPr>
+        <w:pStyle w:val="ListParagraph"/>
+        <w:numPr>
+          <w:ilvl w:val="0"/>
+          <w:numId w:val="2"/>
+        </w:numPr>
+        <w:spacing w:after="20"/>
+      </w:pPr>
+      <w:r>
+        <w:rPr>
+          <w:sz w:val="19"/>
+          <w:szCs w:val="19"/>
+        </w:rPr>
+        <w:t xml:space="preserve">can you top up my student wallet</w:t>
+      </w:r>
+    </w:p>
+    <w:p>
+      <w:pPr>
+        <w:pStyle w:val="ListParagraph"/>
+        <w:numPr>
+          <w:ilvl w:val="0"/>
+          <w:numId w:val="2"/>
+        </w:numPr>
+        <w:spacing w:after="20"/>
+      </w:pPr>
+      <w:r>
+        <w:rPr>
+          <w:sz w:val="19"/>
+          <w:szCs w:val="19"/>
+        </w:rPr>
+        <w:t xml:space="preserve">need to put more balance on my card</w:t>
+      </w:r>
+    </w:p>
+    <w:p>
+      <w:pPr>
+        <w:pStyle w:val="ListParagraph"/>
+        <w:numPr>
+          <w:ilvl w:val="0"/>
+          <w:numId w:val="2"/>
+        </w:numPr>
+        <w:spacing w:after="20"/>
+      </w:pPr>
+      <w:r>
+        <w:rPr>
+          <w:sz w:val="19"/>
+          <w:szCs w:val="19"/>
+        </w:rPr>
+        <w:t xml:space="preserve">how do i add money to my canteen card</w:t>
       </w:r>
     </w:p>
     <w:p>
@@ -2608,7 +2676,7 @@
           <w:b/>
           <w:bCs/>
         </w:rPr>
-        <w:t xml:space="preserve">examples (9):</w:t>
+        <w:t xml:space="preserve">examples (13):</w:t>
       </w:r>
     </w:p>
     <w:p>
@@ -2762,6 +2830,74 @@
           <w:szCs w:val="19"/>
         </w:rPr>
         <w:t xml:space="preserve">do a quick check on my wallet funds</w:t>
+      </w:r>
+    </w:p>
+    <w:p>
+      <w:pPr>
+        <w:pStyle w:val="ListParagraph"/>
+        <w:numPr>
+          <w:ilvl w:val="0"/>
+          <w:numId w:val="2"/>
+        </w:numPr>
+        <w:spacing w:after="20"/>
+      </w:pPr>
+      <w:r>
+        <w:rPr>
+          <w:sz w:val="19"/>
+          <w:szCs w:val="19"/>
+        </w:rPr>
+        <w:t xml:space="preserve">how much balance is left on my campus card</w:t>
+      </w:r>
+    </w:p>
+    <w:p>
+      <w:pPr>
+        <w:pStyle w:val="ListParagraph"/>
+        <w:numPr>
+          <w:ilvl w:val="0"/>
+          <w:numId w:val="2"/>
+        </w:numPr>
+        <w:spacing w:after="20"/>
+      </w:pPr>
+      <w:r>
+        <w:rPr>
+          <w:sz w:val="19"/>
+          <w:szCs w:val="19"/>
+        </w:rPr>
+        <w:t xml:space="preserve">check my remaining wallet funds</w:t>
+      </w:r>
+    </w:p>
+    <w:p>
+      <w:pPr>
+        <w:pStyle w:val="ListParagraph"/>
+        <w:numPr>
+          <w:ilvl w:val="0"/>
+          <w:numId w:val="2"/>
+        </w:numPr>
+        <w:spacing w:after="20"/>
+      </w:pPr>
+      <w:r>
+        <w:rPr>
+          <w:sz w:val="19"/>
+          <w:szCs w:val="19"/>
+        </w:rPr>
+        <w:t xml:space="preserve">tell me my current campus account balance</w:t>
+      </w:r>
+    </w:p>
+    <w:p>
+      <w:pPr>
+        <w:pStyle w:val="ListParagraph"/>
+        <w:numPr>
+          <w:ilvl w:val="0"/>
+          <w:numId w:val="2"/>
+        </w:numPr>
+        <w:spacing w:after="20"/>
+      </w:pPr>
+      <w:r>
+        <w:rPr>
+          <w:sz w:val="19"/>
+          <w:szCs w:val="19"/>
+        </w:rPr>
+        <w:t xml:space="preserve">what is left in my prepaid account</w:t>
       </w:r>
     </w:p>
     <w:p>
@@ -10488,7 +10624,7 @@
           <w:b/>
           <w:bCs/>
         </w:rPr>
-        <w:t xml:space="preserve">examples (5):</w:t>
+        <w:t xml:space="preserve">examples (9):</w:t>
       </w:r>
     </w:p>
     <w:p>
@@ -10574,6 +10710,74 @@
           <w:szCs w:val="19"/>
         </w:rPr>
         <w:t xml:space="preserve">has my request to join the project been reviewed</w:t>
+      </w:r>
+    </w:p>
+    <w:p>
+      <w:pPr>
+        <w:pStyle w:val="ListParagraph"/>
+        <w:numPr>
+          <w:ilvl w:val="0"/>
+          <w:numId w:val="2"/>
+        </w:numPr>
+        <w:spacing w:after="20"/>
+      </w:pPr>
+      <w:r>
+        <w:rPr>
+          <w:sz w:val="19"/>
+          <w:szCs w:val="19"/>
+        </w:rPr>
+        <w:t xml:space="preserve">did they accept me into the project group</w:t>
+      </w:r>
+    </w:p>
+    <w:p>
+      <w:pPr>
+        <w:pStyle w:val="ListParagraph"/>
+        <w:numPr>
+          <w:ilvl w:val="0"/>
+          <w:numId w:val="2"/>
+        </w:numPr>
+        <w:spacing w:after="20"/>
+      </w:pPr>
+      <w:r>
+        <w:rPr>
+          <w:sz w:val="19"/>
+          <w:szCs w:val="19"/>
+        </w:rPr>
+        <w:t xml:space="preserve">update on my request to join a project team</w:t>
+      </w:r>
+    </w:p>
+    <w:p>
+      <w:pPr>
+        <w:pStyle w:val="ListParagraph"/>
+        <w:numPr>
+          <w:ilvl w:val="0"/>
+          <w:numId w:val="2"/>
+        </w:numPr>
+        <w:spacing w:after="20"/>
+      </w:pPr>
+      <w:r>
+        <w:rPr>
+          <w:sz w:val="19"/>
+          <w:szCs w:val="19"/>
+        </w:rPr>
+        <w:t xml:space="preserve">is my project team application approved yet</w:t>
+      </w:r>
+    </w:p>
+    <w:p>
+      <w:pPr>
+        <w:pStyle w:val="ListParagraph"/>
+        <w:numPr>
+          <w:ilvl w:val="0"/>
+          <w:numId w:val="2"/>
+        </w:numPr>
+        <w:spacing w:after="20"/>
+      </w:pPr>
+      <w:r>
+        <w:rPr>
+          <w:sz w:val="19"/>
+          <w:szCs w:val="19"/>
+        </w:rPr>
+        <w:t xml:space="preserve">status check on joining a project group</w:t>
       </w:r>
     </w:p>
     <w:p>
@@ -10620,7 +10824,7 @@
           <w:b/>
           <w:bCs/>
         </w:rPr>
-        <w:t xml:space="preserve">examples (7):</w:t>
+        <w:t xml:space="preserve">examples (11):</w:t>
       </w:r>
     </w:p>
     <w:p>
@@ -10740,6 +10944,74 @@
           <w:szCs w:val="19"/>
         </w:rPr>
         <w:t xml:space="preserve">who's supervising my current project</w:t>
+      </w:r>
+    </w:p>
+    <w:p>
+      <w:pPr>
+        <w:pStyle w:val="ListParagraph"/>
+        <w:numPr>
+          <w:ilvl w:val="0"/>
+          <w:numId w:val="2"/>
+        </w:numPr>
+        <w:spacing w:after="20"/>
+      </w:pPr>
+      <w:r>
+        <w:rPr>
+          <w:sz w:val="19"/>
+          <w:szCs w:val="19"/>
+        </w:rPr>
+        <w:t xml:space="preserve">which academic project am i assigned to</w:t>
+      </w:r>
+    </w:p>
+    <w:p>
+      <w:pPr>
+        <w:pStyle w:val="ListParagraph"/>
+        <w:numPr>
+          <w:ilvl w:val="0"/>
+          <w:numId w:val="2"/>
+        </w:numPr>
+        <w:spacing w:after="20"/>
+      </w:pPr>
+      <w:r>
+        <w:rPr>
+          <w:sz w:val="19"/>
+          <w:szCs w:val="19"/>
+        </w:rPr>
+        <w:t xml:space="preserve">tell me about my ongoing project work</w:t>
+      </w:r>
+    </w:p>
+    <w:p>
+      <w:pPr>
+        <w:pStyle w:val="ListParagraph"/>
+        <w:numPr>
+          <w:ilvl w:val="0"/>
+          <w:numId w:val="2"/>
+        </w:numPr>
+        <w:spacing w:after="20"/>
+      </w:pPr>
+      <w:r>
+        <w:rPr>
+          <w:sz w:val="19"/>
+          <w:szCs w:val="19"/>
+        </w:rPr>
+        <w:t xml:space="preserve">who guides my final year project</w:t>
+      </w:r>
+    </w:p>
+    <w:p>
+      <w:pPr>
+        <w:pStyle w:val="ListParagraph"/>
+        <w:numPr>
+          <w:ilvl w:val="0"/>
+          <w:numId w:val="2"/>
+        </w:numPr>
+        <w:spacing w:after="20"/>
+      </w:pPr>
+      <w:r>
+        <w:rPr>
+          <w:sz w:val="19"/>
+          <w:szCs w:val="19"/>
+        </w:rPr>
+        <w:t xml:space="preserve">details of the project i am doing</w:t>
       </w:r>
     </w:p>
     <w:p>
@@ -13252,7 +13524,7 @@
           <w:b/>
           <w:bCs/>
         </w:rPr>
-        <w:t xml:space="preserve">examples (8):</w:t>
+        <w:t xml:space="preserve">examples (12):</w:t>
       </w:r>
     </w:p>
     <w:p>
@@ -13389,6 +13661,74 @@
           <w:szCs w:val="19"/>
         </w:rPr>
         <w:t xml:space="preserve">any open forms waiting for my response</w:t>
+      </w:r>
+    </w:p>
+    <w:p>
+      <w:pPr>
+        <w:pStyle w:val="ListParagraph"/>
+        <w:numPr>
+          <w:ilvl w:val="0"/>
+          <w:numId w:val="2"/>
+        </w:numPr>
+        <w:spacing w:after="20"/>
+      </w:pPr>
+      <w:r>
+        <w:rPr>
+          <w:sz w:val="19"/>
+          <w:szCs w:val="19"/>
+        </w:rPr>
+        <w:t xml:space="preserve">is there a feedback survey i need to complete</w:t>
+      </w:r>
+    </w:p>
+    <w:p>
+      <w:pPr>
+        <w:pStyle w:val="ListParagraph"/>
+        <w:numPr>
+          <w:ilvl w:val="0"/>
+          <w:numId w:val="2"/>
+        </w:numPr>
+        <w:spacing w:after="20"/>
+      </w:pPr>
+      <w:r>
+        <w:rPr>
+          <w:sz w:val="19"/>
+          <w:szCs w:val="19"/>
+        </w:rPr>
+        <w:t xml:space="preserve">any evaluation forms waiting for me right now</w:t>
+      </w:r>
+    </w:p>
+    <w:p>
+      <w:pPr>
+        <w:pStyle w:val="ListParagraph"/>
+        <w:numPr>
+          <w:ilvl w:val="0"/>
+          <w:numId w:val="2"/>
+        </w:numPr>
+        <w:spacing w:after="20"/>
+      </w:pPr>
+      <w:r>
+        <w:rPr>
+          <w:sz w:val="19"/>
+          <w:szCs w:val="19"/>
+        </w:rPr>
+        <w:t xml:space="preserve">do i have to fill any survey currently</w:t>
+      </w:r>
+    </w:p>
+    <w:p>
+      <w:pPr>
+        <w:pStyle w:val="ListParagraph"/>
+        <w:numPr>
+          <w:ilvl w:val="0"/>
+          <w:numId w:val="2"/>
+        </w:numPr>
+        <w:spacing w:after="20"/>
+      </w:pPr>
+      <w:r>
+        <w:rPr>
+          <w:sz w:val="19"/>
+          <w:szCs w:val="19"/>
+        </w:rPr>
+        <w:t xml:space="preserve">list the surveys i still need to respond to</w:t>
       </w:r>
     </w:p>
     <w:p>
@@ -13435,7 +13775,7 @@
           <w:b/>
           <w:bCs/>
         </w:rPr>
-        <w:t xml:space="preserve">examples (8):</w:t>
+        <w:t xml:space="preserve">examples (12):</w:t>
       </w:r>
     </w:p>
     <w:p>
@@ -13572,6 +13912,74 @@
           <w:szCs w:val="19"/>
         </w:rPr>
         <w:t xml:space="preserve">take me to submit my course feedback</w:t>
+      </w:r>
+    </w:p>
+    <w:p>
+      <w:pPr>
+        <w:pStyle w:val="ListParagraph"/>
+        <w:numPr>
+          <w:ilvl w:val="0"/>
+          <w:numId w:val="2"/>
+        </w:numPr>
+        <w:spacing w:after="20"/>
+      </w:pPr>
+      <w:r>
+        <w:rPr>
+          <w:sz w:val="19"/>
+          <w:szCs w:val="19"/>
+        </w:rPr>
+        <w:t xml:space="preserve">where do i go to submit course feedback</w:t>
+      </w:r>
+    </w:p>
+    <w:p>
+      <w:pPr>
+        <w:pStyle w:val="ListParagraph"/>
+        <w:numPr>
+          <w:ilvl w:val="0"/>
+          <w:numId w:val="2"/>
+        </w:numPr>
+        <w:spacing w:after="20"/>
+      </w:pPr>
+      <w:r>
+        <w:rPr>
+          <w:sz w:val="19"/>
+          <w:szCs w:val="19"/>
+        </w:rPr>
+        <w:t xml:space="preserve">i would like to complete the evaluation form</w:t>
+      </w:r>
+    </w:p>
+    <w:p>
+      <w:pPr>
+        <w:pStyle w:val="ListParagraph"/>
+        <w:numPr>
+          <w:ilvl w:val="0"/>
+          <w:numId w:val="2"/>
+        </w:numPr>
+        <w:spacing w:after="20"/>
+      </w:pPr>
+      <w:r>
+        <w:rPr>
+          <w:sz w:val="19"/>
+          <w:szCs w:val="19"/>
+        </w:rPr>
+        <w:t xml:space="preserve">help me submit my feedback for this semester</w:t>
+      </w:r>
+    </w:p>
+    <w:p>
+      <w:pPr>
+        <w:pStyle w:val="ListParagraph"/>
+        <w:numPr>
+          <w:ilvl w:val="0"/>
+          <w:numId w:val="2"/>
+        </w:numPr>
+        <w:spacing w:after="20"/>
+      </w:pPr>
+      <w:r>
+        <w:rPr>
+          <w:sz w:val="19"/>
+          <w:szCs w:val="19"/>
+        </w:rPr>
+        <w:t xml:space="preserve">link to fill in my survey response</w:t>
       </w:r>
     </w:p>
     <w:p>
@@ -14311,7 +14719,7 @@
           <w:b/>
           <w:bCs/>
         </w:rPr>
-        <w:t xml:space="preserve">examples (5):</w:t>
+        <w:t xml:space="preserve">examples (9):</w:t>
       </w:r>
     </w:p>
     <w:p>
@@ -14397,6 +14805,74 @@
           <w:szCs w:val="19"/>
         </w:rPr>
         <w:t xml:space="preserve">department achievement list</w:t>
+      </w:r>
+    </w:p>
+    <w:p>
+      <w:pPr>
+        <w:pStyle w:val="ListParagraph"/>
+        <w:numPr>
+          <w:ilvl w:val="0"/>
+          <w:numId w:val="2"/>
+        </w:numPr>
+        <w:spacing w:after="20"/>
+      </w:pPr>
+      <w:r>
+        <w:rPr>
+          <w:sz w:val="19"/>
+          <w:szCs w:val="19"/>
+        </w:rPr>
+        <w:t xml:space="preserve">notable achievements from our department this year</w:t>
+      </w:r>
+    </w:p>
+    <w:p>
+      <w:pPr>
+        <w:pStyle w:val="ListParagraph"/>
+        <w:numPr>
+          <w:ilvl w:val="0"/>
+          <w:numId w:val="2"/>
+        </w:numPr>
+        <w:spacing w:after="20"/>
+      </w:pPr>
+      <w:r>
+        <w:rPr>
+          <w:sz w:val="19"/>
+          <w:szCs w:val="19"/>
+        </w:rPr>
+        <w:t xml:space="preserve">what has my department accomplished recently</w:t>
+      </w:r>
+    </w:p>
+    <w:p>
+      <w:pPr>
+        <w:pStyle w:val="ListParagraph"/>
+        <w:numPr>
+          <w:ilvl w:val="0"/>
+          <w:numId w:val="2"/>
+        </w:numPr>
+        <w:spacing w:after="20"/>
+      </w:pPr>
+      <w:r>
+        <w:rPr>
+          <w:sz w:val="19"/>
+          <w:szCs w:val="19"/>
+        </w:rPr>
+        <w:t xml:space="preserve">department recognition or awards list</w:t>
+      </w:r>
+    </w:p>
+    <w:p>
+      <w:pPr>
+        <w:pStyle w:val="ListParagraph"/>
+        <w:numPr>
+          <w:ilvl w:val="0"/>
+          <w:numId w:val="2"/>
+        </w:numPr>
+        <w:spacing w:after="20"/>
+      </w:pPr>
+      <w:r>
+        <w:rPr>
+          <w:sz w:val="19"/>
+          <w:szCs w:val="19"/>
+        </w:rPr>
+        <w:t xml:space="preserve">highlights of our department's achievements</w:t>
       </w:r>
     </w:p>
     <w:p>
@@ -17929,7 +18405,7 @@
           <w:b/>
           <w:bCs/>
         </w:rPr>
-        <w:t xml:space="preserve">examples (9):</w:t>
+        <w:t xml:space="preserve">examples (13):</w:t>
       </w:r>
     </w:p>
     <w:p>
@@ -18083,6 +18559,74 @@
           <w:szCs w:val="19"/>
         </w:rPr>
         <w:t xml:space="preserve">has result pub happened</w:t>
+      </w:r>
+    </w:p>
+    <w:p>
+      <w:pPr>
+        <w:pStyle w:val="ListParagraph"/>
+        <w:numPr>
+          <w:ilvl w:val="0"/>
+          <w:numId w:val="2"/>
+        </w:numPr>
+        <w:spacing w:after="20"/>
+      </w:pPr>
+      <w:r>
+        <w:rPr>
+          <w:sz w:val="19"/>
+          <w:szCs w:val="19"/>
+        </w:rPr>
+        <w:t xml:space="preserve">when are the semester results coming out</w:t>
+      </w:r>
+    </w:p>
+    <w:p>
+      <w:pPr>
+        <w:pStyle w:val="ListParagraph"/>
+        <w:numPr>
+          <w:ilvl w:val="0"/>
+          <w:numId w:val="2"/>
+        </w:numPr>
+        <w:spacing w:after="20"/>
+      </w:pPr>
+      <w:r>
+        <w:rPr>
+          <w:sz w:val="19"/>
+          <w:szCs w:val="19"/>
+        </w:rPr>
+        <w:t xml:space="preserve">is the exam result declared yet</w:t>
+      </w:r>
+    </w:p>
+    <w:p>
+      <w:pPr>
+        <w:pStyle w:val="ListParagraph"/>
+        <w:numPr>
+          <w:ilvl w:val="0"/>
+          <w:numId w:val="2"/>
+        </w:numPr>
+        <w:spacing w:after="20"/>
+      </w:pPr>
+      <w:r>
+        <w:rPr>
+          <w:sz w:val="19"/>
+          <w:szCs w:val="19"/>
+        </w:rPr>
+        <w:t xml:space="preserve">has the university published the results</w:t>
+      </w:r>
+    </w:p>
+    <w:p>
+      <w:pPr>
+        <w:pStyle w:val="ListParagraph"/>
+        <w:numPr>
+          <w:ilvl w:val="0"/>
+          <w:numId w:val="2"/>
+        </w:numPr>
+        <w:spacing w:after="20"/>
+      </w:pPr>
+      <w:r>
+        <w:rPr>
+          <w:sz w:val="19"/>
+          <w:szCs w:val="19"/>
+        </w:rPr>
+        <w:t xml:space="preserve">find out if my results are out</w:t>
       </w:r>
     </w:p>
     <w:p>
@@ -29619,7 +30163,7 @@
           <w:b/>
           <w:bCs/>
         </w:rPr>
-        <w:t xml:space="preserve">examples (8):</w:t>
+        <w:t xml:space="preserve">examples (12):</w:t>
       </w:r>
     </w:p>
     <w:p>
@@ -29756,6 +30300,74 @@
           <w:szCs w:val="19"/>
         </w:rPr>
         <w:t xml:space="preserve">find alumni by company name</w:t>
+      </w:r>
+    </w:p>
+    <w:p>
+      <w:pPr>
+        <w:pStyle w:val="ListParagraph"/>
+        <w:numPr>
+          <w:ilvl w:val="0"/>
+          <w:numId w:val="2"/>
+        </w:numPr>
+        <w:spacing w:after="20"/>
+      </w:pPr>
+      <w:r>
+        <w:rPr>
+          <w:sz w:val="19"/>
+          <w:szCs w:val="19"/>
+        </w:rPr>
+        <w:t xml:space="preserve">look up alumni employed at a company</w:t>
+      </w:r>
+    </w:p>
+    <w:p>
+      <w:pPr>
+        <w:pStyle w:val="ListParagraph"/>
+        <w:numPr>
+          <w:ilvl w:val="0"/>
+          <w:numId w:val="2"/>
+        </w:numPr>
+        <w:spacing w:after="20"/>
+      </w:pPr>
+      <w:r>
+        <w:rPr>
+          <w:sz w:val="19"/>
+          <w:szCs w:val="19"/>
+        </w:rPr>
+        <w:t xml:space="preserve">search for graduates working in a specific firm</w:t>
+      </w:r>
+    </w:p>
+    <w:p>
+      <w:pPr>
+        <w:pStyle w:val="ListParagraph"/>
+        <w:numPr>
+          <w:ilvl w:val="0"/>
+          <w:numId w:val="2"/>
+        </w:numPr>
+        <w:spacing w:after="20"/>
+      </w:pPr>
+      <w:r>
+        <w:rPr>
+          <w:sz w:val="19"/>
+          <w:szCs w:val="19"/>
+        </w:rPr>
+        <w:t xml:space="preserve">find former students in the alumni database</w:t>
+      </w:r>
+    </w:p>
+    <w:p>
+      <w:pPr>
+        <w:pStyle w:val="ListParagraph"/>
+        <w:numPr>
+          <w:ilvl w:val="0"/>
+          <w:numId w:val="2"/>
+        </w:numPr>
+        <w:spacing w:after="20"/>
+      </w:pPr>
+      <w:r>
+        <w:rPr>
+          <w:sz w:val="19"/>
+          <w:szCs w:val="19"/>
+        </w:rPr>
+        <w:t xml:space="preserve">who from our alumni works at this company</w:t>
       </w:r>
     </w:p>
     <w:p>
@@ -47740,7 +48352,7 @@
           <w:b/>
           <w:bCs/>
         </w:rPr>
-        <w:t xml:space="preserve">examples (8):</w:t>
+        <w:t xml:space="preserve">examples (12):</w:t>
       </w:r>
     </w:p>
     <w:p>
@@ -47877,6 +48489,74 @@
           <w:szCs w:val="19"/>
         </w:rPr>
         <w:t xml:space="preserve">unable to log into my account, need a reset</w:t>
+      </w:r>
+    </w:p>
+    <w:p>
+      <w:pPr>
+        <w:pStyle w:val="ListParagraph"/>
+        <w:numPr>
+          <w:ilvl w:val="0"/>
+          <w:numId w:val="2"/>
+        </w:numPr>
+        <w:spacing w:after="20"/>
+      </w:pPr>
+      <w:r>
+        <w:rPr>
+          <w:sz w:val="19"/>
+          <w:szCs w:val="19"/>
+        </w:rPr>
+        <w:t xml:space="preserve">my account is locked, how do i reset the password</w:t>
+      </w:r>
+    </w:p>
+    <w:p>
+      <w:pPr>
+        <w:pStyle w:val="ListParagraph"/>
+        <w:numPr>
+          <w:ilvl w:val="0"/>
+          <w:numId w:val="2"/>
+        </w:numPr>
+        <w:spacing w:after="20"/>
+      </w:pPr>
+      <w:r>
+        <w:rPr>
+          <w:sz w:val="19"/>
+          <w:szCs w:val="19"/>
+        </w:rPr>
+        <w:t xml:space="preserve">i need help resetting my login credentials</w:t>
+      </w:r>
+    </w:p>
+    <w:p>
+      <w:pPr>
+        <w:pStyle w:val="ListParagraph"/>
+        <w:numPr>
+          <w:ilvl w:val="0"/>
+          <w:numId w:val="2"/>
+        </w:numPr>
+        <w:spacing w:after="20"/>
+      </w:pPr>
+      <w:r>
+        <w:rPr>
+          <w:sz w:val="19"/>
+          <w:szCs w:val="19"/>
+        </w:rPr>
+        <w:t xml:space="preserve">trouble logging in, password reset please</w:t>
+      </w:r>
+    </w:p>
+    <w:p>
+      <w:pPr>
+        <w:pStyle w:val="ListParagraph"/>
+        <w:numPr>
+          <w:ilvl w:val="0"/>
+          <w:numId w:val="2"/>
+        </w:numPr>
+        <w:spacing w:after="20"/>
+      </w:pPr>
+      <w:r>
+        <w:rPr>
+          <w:sz w:val="19"/>
+          <w:szCs w:val="19"/>
+        </w:rPr>
+        <w:t xml:space="preserve">can you help me recover my account password</w:t>
       </w:r>
     </w:p>
     <w:p>
@@ -48459,7 +49139,7 @@
           <w:b/>
           <w:bCs/>
         </w:rPr>
-        <w:t xml:space="preserve">examples (6):</w:t>
+        <w:t xml:space="preserve">examples (10):</w:t>
       </w:r>
     </w:p>
     <w:p>
@@ -48562,6 +49242,74 @@
           <w:szCs w:val="19"/>
         </w:rPr>
         <w:t xml:space="preserve">Library timings please</w:t>
+      </w:r>
+    </w:p>
+    <w:p>
+      <w:pPr>
+        <w:pStyle w:val="ListParagraph"/>
+        <w:numPr>
+          <w:ilvl w:val="0"/>
+          <w:numId w:val="2"/>
+        </w:numPr>
+        <w:spacing w:after="20"/>
+      </w:pPr>
+      <w:r>
+        <w:rPr>
+          <w:sz w:val="19"/>
+          <w:szCs w:val="19"/>
+        </w:rPr>
+        <w:t xml:space="preserve">what time does the library close today</w:t>
+      </w:r>
+    </w:p>
+    <w:p>
+      <w:pPr>
+        <w:pStyle w:val="ListParagraph"/>
+        <w:numPr>
+          <w:ilvl w:val="0"/>
+          <w:numId w:val="2"/>
+        </w:numPr>
+        <w:spacing w:after="20"/>
+      </w:pPr>
+      <w:r>
+        <w:rPr>
+          <w:sz w:val="19"/>
+          <w:szCs w:val="19"/>
+        </w:rPr>
+        <w:t xml:space="preserve">library opening and closing time</w:t>
+      </w:r>
+    </w:p>
+    <w:p>
+      <w:pPr>
+        <w:pStyle w:val="ListParagraph"/>
+        <w:numPr>
+          <w:ilvl w:val="0"/>
+          <w:numId w:val="2"/>
+        </w:numPr>
+        <w:spacing w:after="20"/>
+      </w:pPr>
+      <w:r>
+        <w:rPr>
+          <w:sz w:val="19"/>
+          <w:szCs w:val="19"/>
+        </w:rPr>
+        <w:t xml:space="preserve">when can i visit the library</w:t>
+      </w:r>
+    </w:p>
+    <w:p>
+      <w:pPr>
+        <w:pStyle w:val="ListParagraph"/>
+        <w:numPr>
+          <w:ilvl w:val="0"/>
+          <w:numId w:val="2"/>
+        </w:numPr>
+        <w:spacing w:after="20"/>
+      </w:pPr>
+      <w:r>
+        <w:rPr>
+          <w:sz w:val="19"/>
+          <w:szCs w:val="19"/>
+        </w:rPr>
+        <w:t xml:space="preserve">operating hours for the library</w:t>
       </w:r>
     </w:p>
     <w:sectPr>

</xml_diff>

<commit_message>
fix(nlu): stop 'previous semester marks' misrouting to injection_attempt; anchor cross-section comparison to admin_institution_performance
1. 'my previous semester marks' misclassified as injection_attempt (0.723)
   -- a completely benign, common student question flagged as a prompt-
   injection attempt. Root cause: injection_attempt's own training example
   'show me another student's marks' shares enough surface wording with
   ordinary marks questions to collide -- get_marks had 'this semester'
   but nothing for 'last'/'previous' semester, now a real expected
   phrasing given the semester-filtering feature built earlier.

2. 'compare marks across sections' resolved to section_performance instead
   of the new admin_institution_performance -- that intent's examples
   didn't cover the word 'compare' yet.

Verified: both now resolve correctly (1.000 confidence), real
injection_attempt/section_performance examples unaffected.
</commit_message>
<xml_diff>
--- a/EOS_Intent_Training_Dataset_English_Only.docx
+++ b/EOS_Intent_Training_Dataset_English_Only.docx
@@ -54,7 +54,7 @@
           <w:b/>
           <w:bCs/>
         </w:rPr>
-        <w:t xml:space="preserve">examples (71):</w:t>
+        <w:t xml:space="preserve">examples (76):</w:t>
       </w:r>
     </w:p>
     <w:p>
@@ -1262,6 +1262,91 @@
           <w:szCs w:val="19"/>
         </w:rPr>
         <w:t xml:space="preserve">what score did i get in my recent internal exam</w:t>
+      </w:r>
+    </w:p>
+    <w:p>
+      <w:pPr>
+        <w:pStyle w:val="ListParagraph"/>
+        <w:numPr>
+          <w:ilvl w:val="0"/>
+          <w:numId w:val="2"/>
+        </w:numPr>
+        <w:spacing w:after="20"/>
+      </w:pPr>
+      <w:r>
+        <w:rPr>
+          <w:sz w:val="19"/>
+          <w:szCs w:val="19"/>
+        </w:rPr>
+        <w:t xml:space="preserve">my previous semester marks</w:t>
+      </w:r>
+    </w:p>
+    <w:p>
+      <w:pPr>
+        <w:pStyle w:val="ListParagraph"/>
+        <w:numPr>
+          <w:ilvl w:val="0"/>
+          <w:numId w:val="2"/>
+        </w:numPr>
+        <w:spacing w:after="20"/>
+      </w:pPr>
+      <w:r>
+        <w:rPr>
+          <w:sz w:val="19"/>
+          <w:szCs w:val="19"/>
+        </w:rPr>
+        <w:t xml:space="preserve">marks from last semester</w:t>
+      </w:r>
+    </w:p>
+    <w:p>
+      <w:pPr>
+        <w:pStyle w:val="ListParagraph"/>
+        <w:numPr>
+          <w:ilvl w:val="0"/>
+          <w:numId w:val="2"/>
+        </w:numPr>
+        <w:spacing w:after="20"/>
+      </w:pPr>
+      <w:r>
+        <w:rPr>
+          <w:sz w:val="19"/>
+          <w:szCs w:val="19"/>
+        </w:rPr>
+        <w:t xml:space="preserve">what did i score last semester</w:t>
+      </w:r>
+    </w:p>
+    <w:p>
+      <w:pPr>
+        <w:pStyle w:val="ListParagraph"/>
+        <w:numPr>
+          <w:ilvl w:val="0"/>
+          <w:numId w:val="2"/>
+        </w:numPr>
+        <w:spacing w:after="20"/>
+      </w:pPr>
+      <w:r>
+        <w:rPr>
+          <w:sz w:val="19"/>
+          <w:szCs w:val="19"/>
+        </w:rPr>
+        <w:t xml:space="preserve">previous sem marks</w:t>
+      </w:r>
+    </w:p>
+    <w:p>
+      <w:pPr>
+        <w:pStyle w:val="ListParagraph"/>
+        <w:numPr>
+          <w:ilvl w:val="0"/>
+          <w:numId w:val="2"/>
+        </w:numPr>
+        <w:spacing w:after="20"/>
+      </w:pPr>
+      <w:r>
+        <w:rPr>
+          <w:sz w:val="19"/>
+          <w:szCs w:val="19"/>
+        </w:rPr>
+        <w:t xml:space="preserve">show my last semester results</w:t>
       </w:r>
     </w:p>
     <w:p>
@@ -18103,7 +18188,7 @@
           <w:b/>
           <w:bCs/>
         </w:rPr>
-        <w:t xml:space="preserve">examples (15):</w:t>
+        <w:t xml:space="preserve">examples (22):</w:t>
       </w:r>
     </w:p>
     <w:p>
@@ -18359,6 +18444,125 @@
           <w:szCs w:val="19"/>
         </w:rPr>
         <w:t xml:space="preserve">can i appear for the semester exams this time</w:t>
+      </w:r>
+    </w:p>
+    <w:p>
+      <w:pPr>
+        <w:pStyle w:val="ListParagraph"/>
+        <w:numPr>
+          <w:ilvl w:val="0"/>
+          <w:numId w:val="2"/>
+        </w:numPr>
+        <w:spacing w:after="20"/>
+      </w:pPr>
+      <w:r>
+        <w:rPr>
+          <w:sz w:val="19"/>
+          <w:szCs w:val="19"/>
+        </w:rPr>
+        <w:t xml:space="preserve">im worried about my attendance, how much leave can i take more</w:t>
+      </w:r>
+    </w:p>
+    <w:p>
+      <w:pPr>
+        <w:pStyle w:val="ListParagraph"/>
+        <w:numPr>
+          <w:ilvl w:val="0"/>
+          <w:numId w:val="2"/>
+        </w:numPr>
+        <w:spacing w:after="20"/>
+      </w:pPr>
+      <w:r>
+        <w:rPr>
+          <w:sz w:val="19"/>
+          <w:szCs w:val="19"/>
+        </w:rPr>
+        <w:t xml:space="preserve">how many more classes can i afford to miss</w:t>
+      </w:r>
+    </w:p>
+    <w:p>
+      <w:pPr>
+        <w:pStyle w:val="ListParagraph"/>
+        <w:numPr>
+          <w:ilvl w:val="0"/>
+          <w:numId w:val="2"/>
+        </w:numPr>
+        <w:spacing w:after="20"/>
+      </w:pPr>
+      <w:r>
+        <w:rPr>
+          <w:sz w:val="19"/>
+          <w:szCs w:val="19"/>
+        </w:rPr>
+        <w:t xml:space="preserve">how much more leave can i take before i lose eligibility</w:t>
+      </w:r>
+    </w:p>
+    <w:p>
+      <w:pPr>
+        <w:pStyle w:val="ListParagraph"/>
+        <w:numPr>
+          <w:ilvl w:val="0"/>
+          <w:numId w:val="2"/>
+        </w:numPr>
+        <w:spacing w:after="20"/>
+      </w:pPr>
+      <w:r>
+        <w:rPr>
+          <w:sz w:val="19"/>
+          <w:szCs w:val="19"/>
+        </w:rPr>
+        <w:t xml:space="preserve">how many days can i still be absent and stay eligible</w:t>
+      </w:r>
+    </w:p>
+    <w:p>
+      <w:pPr>
+        <w:pStyle w:val="ListParagraph"/>
+        <w:numPr>
+          <w:ilvl w:val="0"/>
+          <w:numId w:val="2"/>
+        </w:numPr>
+        <w:spacing w:after="20"/>
+      </w:pPr>
+      <w:r>
+        <w:rPr>
+          <w:sz w:val="19"/>
+          <w:szCs w:val="19"/>
+        </w:rPr>
+        <w:t xml:space="preserve">whats the maximum leave i can take without affecting my eligibility</w:t>
+      </w:r>
+    </w:p>
+    <w:p>
+      <w:pPr>
+        <w:pStyle w:val="ListParagraph"/>
+        <w:numPr>
+          <w:ilvl w:val="0"/>
+          <w:numId w:val="2"/>
+        </w:numPr>
+        <w:spacing w:after="20"/>
+      </w:pPr>
+      <w:r>
+        <w:rPr>
+          <w:sz w:val="19"/>
+          <w:szCs w:val="19"/>
+        </w:rPr>
+        <w:t xml:space="preserve">how much attendance buffer do i have left</w:t>
+      </w:r>
+    </w:p>
+    <w:p>
+      <w:pPr>
+        <w:pStyle w:val="ListParagraph"/>
+        <w:numPr>
+          <w:ilvl w:val="0"/>
+          <w:numId w:val="2"/>
+        </w:numPr>
+        <w:spacing w:after="20"/>
+      </w:pPr>
+      <w:r>
+        <w:rPr>
+          <w:sz w:val="19"/>
+          <w:szCs w:val="19"/>
+        </w:rPr>
+        <w:t xml:space="preserve">im scared my attendance is too low, can i still miss classes</w:t>
       </w:r>
     </w:p>
     <w:p>
@@ -36795,7 +36999,7 @@
           <w:b/>
           <w:bCs/>
         </w:rPr>
-        <w:t xml:space="preserve">examples (18):</w:t>
+        <w:t xml:space="preserve">examples (22):</w:t>
       </w:r>
     </w:p>
     <w:p>
@@ -37102,6 +37306,74 @@
           <w:szCs w:val="19"/>
         </w:rPr>
         <w:t xml:space="preserve">top performing section across the college</w:t>
+      </w:r>
+    </w:p>
+    <w:p>
+      <w:pPr>
+        <w:pStyle w:val="ListParagraph"/>
+        <w:numPr>
+          <w:ilvl w:val="0"/>
+          <w:numId w:val="2"/>
+        </w:numPr>
+        <w:spacing w:after="20"/>
+      </w:pPr>
+      <w:r>
+        <w:rPr>
+          <w:sz w:val="19"/>
+          <w:szCs w:val="19"/>
+        </w:rPr>
+        <w:t xml:space="preserve">compare marks across all sections</w:t>
+      </w:r>
+    </w:p>
+    <w:p>
+      <w:pPr>
+        <w:pStyle w:val="ListParagraph"/>
+        <w:numPr>
+          <w:ilvl w:val="0"/>
+          <w:numId w:val="2"/>
+        </w:numPr>
+        <w:spacing w:after="20"/>
+      </w:pPr>
+      <w:r>
+        <w:rPr>
+          <w:sz w:val="19"/>
+          <w:szCs w:val="19"/>
+        </w:rPr>
+        <w:t xml:space="preserve">compare all sections marks</w:t>
+      </w:r>
+    </w:p>
+    <w:p>
+      <w:pPr>
+        <w:pStyle w:val="ListParagraph"/>
+        <w:numPr>
+          <w:ilvl w:val="0"/>
+          <w:numId w:val="2"/>
+        </w:numPr>
+        <w:spacing w:after="20"/>
+      </w:pPr>
+      <w:r>
+        <w:rPr>
+          <w:sz w:val="19"/>
+          <w:szCs w:val="19"/>
+        </w:rPr>
+        <w:t xml:space="preserve">compare attendance across sections</w:t>
+      </w:r>
+    </w:p>
+    <w:p>
+      <w:pPr>
+        <w:pStyle w:val="ListParagraph"/>
+        <w:numPr>
+          <w:ilvl w:val="0"/>
+          <w:numId w:val="2"/>
+        </w:numPr>
+        <w:spacing w:after="20"/>
+      </w:pPr>
+      <w:r>
+        <w:rPr>
+          <w:sz w:val="19"/>
+          <w:szCs w:val="19"/>
+        </w:rPr>
+        <w:t xml:space="preserve">section wise comparison of marks</w:t>
       </w:r>
     </w:p>
     <w:p>

</xml_diff>